<commit_message>
feat(education): add optimized cover images for 14 articles and categories
</commit_message>
<xml_diff>
--- a/docs/防曬晴報員_PPT逐頁製作稿.docx
+++ b/docs/防曬晴報員_PPT逐頁製作稿.docx
@@ -4598,7 +4598,7 @@
           <w:sz w:val="34"/>
           <w:szCs w:val="34"/>
         </w:rPr>
-        <w:t xml:space="preserve">本機是主體，後端提供網路服務</w:t>
+        <w:t xml:space="preserve">本機優先，也提供多種提醒方式</w:t>
       </w:r>
     </w:p>
     <w:p>
@@ -4738,7 +4738,7 @@
                 <w:sz w:val="22"/>
                 <w:szCs w:val="22"/>
               </w:rPr>
-              <w:t xml:space="preserve">用非工程背景也能理解的方式說明系統分工。</w:t>
+              <w:t xml:space="preserve">用熟悉的使用情境說明本機核心、瀏覽器通知與 LINE 提醒的分工。</w:t>
             </w:r>
           </w:p>
         </w:tc>
@@ -4794,7 +4794,7 @@
                 <w:sz w:val="22"/>
                 <w:szCs w:val="22"/>
               </w:rPr>
-              <w:t xml:space="preserve">左右分區：裝置端 IndexedDB／Supabase 網路服務，中間標示選配同步。</w:t>
+              <w:t xml:space="preserve">左側放 LINE 通知設定截圖；右側分成核心功能、選用提醒與網路服務三層。</w:t>
             </w:r>
           </w:p>
         </w:tc>
@@ -4832,45 +4832,64 @@
           <w:sz w:val="21"/>
           <w:szCs w:val="21"/>
         </w:rPr>
-        <w:t xml:space="preserve">本機 IndexedDB｜提醒、事件與設定</w:t>
-      </w:r>
-    </w:p>
-    <w:p>
-      <w:pPr>
-        <w:pStyle w:val="ListParagraph"/>
-        <w:numPr>
-          <w:ilvl w:val="0"/>
-          <w:numId w:val="2"/>
-        </w:numPr>
-        <w:spacing w:after="90" w:line="290"/>
-      </w:pPr>
-      <w:r>
-        <w:rPr>
-          <w:rFonts w:ascii="Noto Sans TC" w:cs="Noto Sans TC" w:eastAsia="Noto Sans TC" w:hAnsi="Noto Sans TC"/>
-          <w:color w:val="5A4540"/>
-          <w:sz w:val="21"/>
-          <w:szCs w:val="21"/>
-        </w:rPr>
-        <w:t xml:space="preserve">Supabase｜UV 代理與快取、選配同步、推播、回饋與帳號刪除</w:t>
-      </w:r>
-    </w:p>
-    <w:p>
-      <w:pPr>
-        <w:pStyle w:val="ListParagraph"/>
-        <w:numPr>
-          <w:ilvl w:val="0"/>
-          <w:numId w:val="2"/>
-        </w:numPr>
-        <w:spacing w:after="90" w:line="290"/>
-      </w:pPr>
-      <w:r>
-        <w:rPr>
-          <w:rFonts w:ascii="Noto Sans TC" w:cs="Noto Sans TC" w:eastAsia="Noto Sans TC" w:hAnsi="Noto Sans TC"/>
-          <w:color w:val="5A4540"/>
-          <w:sz w:val="21"/>
-          <w:szCs w:val="21"/>
-        </w:rPr>
-        <w:t xml:space="preserve">核心本機提醒不需登入；即時 UV 與網路服務需要連線</w:t>
+        <w:t xml:space="preserve">本機核心｜不登入也能使用倒數與紀錄</w:t>
+      </w:r>
+    </w:p>
+    <w:p>
+      <w:pPr>
+        <w:pStyle w:val="ListParagraph"/>
+        <w:numPr>
+          <w:ilvl w:val="0"/>
+          <w:numId w:val="2"/>
+        </w:numPr>
+        <w:spacing w:after="90" w:line="290"/>
+      </w:pPr>
+      <w:r>
+        <w:rPr>
+          <w:rFonts w:ascii="Noto Sans TC" w:cs="Noto Sans TC" w:eastAsia="Noto Sans TC" w:hAnsi="Noto Sans TC"/>
+          <w:color w:val="5A4540"/>
+          <w:sz w:val="21"/>
+          <w:szCs w:val="21"/>
+        </w:rPr>
+        <w:t xml:space="preserve">瀏覽器通知｜分頁關閉後，仍有機會收到補擦提醒</w:t>
+      </w:r>
+    </w:p>
+    <w:p>
+      <w:pPr>
+        <w:pStyle w:val="ListParagraph"/>
+        <w:numPr>
+          <w:ilvl w:val="0"/>
+          <w:numId w:val="2"/>
+        </w:numPr>
+        <w:spacing w:after="90" w:line="290"/>
+      </w:pPr>
+      <w:r>
+        <w:rPr>
+          <w:rFonts w:ascii="Noto Sans TC" w:cs="Noto Sans TC" w:eastAsia="Noto Sans TC" w:hAnsi="Noto Sans TC"/>
+          <w:color w:val="5A4540"/>
+          <w:sz w:val="21"/>
+          <w:szCs w:val="21"/>
+        </w:rPr>
+        <w:t xml:space="preserve">LINE 補擦提醒｜主動綁定，可測試通知，也能隨時解除</w:t>
+      </w:r>
+    </w:p>
+    <w:p>
+      <w:pPr>
+        <w:pStyle w:val="ListParagraph"/>
+        <w:numPr>
+          <w:ilvl w:val="0"/>
+          <w:numId w:val="2"/>
+        </w:numPr>
+        <w:spacing w:after="90" w:line="290"/>
+      </w:pPr>
+      <w:r>
+        <w:rPr>
+          <w:rFonts w:ascii="Noto Sans TC" w:cs="Noto Sans TC" w:eastAsia="Noto Sans TC" w:hAnsi="Noto Sans TC"/>
+          <w:color w:val="5A4540"/>
+          <w:sz w:val="21"/>
+          <w:szCs w:val="21"/>
+        </w:rPr>
+        <w:t xml:space="preserve">遠端提醒需要網路；實際送達仍受裝置、平台與網路狀態影響</w:t>
       </w:r>
     </w:p>
     <w:p>
@@ -4905,26 +4924,45 @@
           <w:sz w:val="21"/>
           <w:szCs w:val="21"/>
         </w:rPr>
-        <w:t xml:space="preserve">兩欄架構圖</w:t>
-      </w:r>
-    </w:p>
-    <w:p>
-      <w:pPr>
-        <w:pStyle w:val="ListParagraph"/>
-        <w:numPr>
-          <w:ilvl w:val="0"/>
-          <w:numId w:val="2"/>
-        </w:numPr>
-        <w:spacing w:after="90" w:line="290"/>
-      </w:pPr>
-      <w:r>
-        <w:rPr>
-          <w:rFonts w:ascii="Noto Sans TC" w:cs="Noto Sans TC" w:eastAsia="Noto Sans TC" w:hAnsi="Noto Sans TC"/>
-          <w:color w:val="5A4540"/>
-          <w:sz w:val="21"/>
-          <w:szCs w:val="21"/>
-        </w:rPr>
-        <w:t xml:space="preserve">使用者主動登入的虛線箭頭</w:t>
+        <w:t xml:space="preserve">LINE 補擦提醒設定畫面</w:t>
+      </w:r>
+    </w:p>
+    <w:p>
+      <w:pPr>
+        <w:pStyle w:val="ListParagraph"/>
+        <w:numPr>
+          <w:ilvl w:val="0"/>
+          <w:numId w:val="2"/>
+        </w:numPr>
+        <w:spacing w:after="90" w:line="290"/>
+      </w:pPr>
+      <w:r>
+        <w:rPr>
+          <w:rFonts w:ascii="Noto Sans TC" w:cs="Noto Sans TC" w:eastAsia="Noto Sans TC" w:hAnsi="Noto Sans TC"/>
+          <w:color w:val="5A4540"/>
+          <w:sz w:val="21"/>
+          <w:szCs w:val="21"/>
+        </w:rPr>
+        <w:t xml:space="preserve">已連結狀態或實際收到訊息的截圖</w:t>
+      </w:r>
+    </w:p>
+    <w:p>
+      <w:pPr>
+        <w:pStyle w:val="ListParagraph"/>
+        <w:numPr>
+          <w:ilvl w:val="0"/>
+          <w:numId w:val="2"/>
+        </w:numPr>
+        <w:spacing w:after="90" w:line="290"/>
+      </w:pPr>
+      <w:r>
+        <w:rPr>
+          <w:rFonts w:ascii="Noto Sans TC" w:cs="Noto Sans TC" w:eastAsia="Noto Sans TC" w:hAnsi="Noto Sans TC"/>
+          <w:color w:val="5A4540"/>
+          <w:sz w:val="21"/>
+          <w:szCs w:val="21"/>
+        </w:rPr>
+        <w:t xml:space="preserve">本機核心→選用提醒→網路服務三層圖</w:t>
       </w:r>
     </w:p>
     <w:p>
@@ -4981,7 +5019,7 @@
                 <w:sz w:val="22"/>
                 <w:szCs w:val="22"/>
               </w:rPr>
-              <w:t xml:space="preserve">架構原則是本機為主體，後端是選配與網路服務層。提醒、事件與設定先存在瀏覽器 IndexedDB；Supabase 負責 UV 資料代理與快取、登入後的雲端同步、背景推播、匿名回饋與帳號刪除。不登入仍可使用本機核心流程，但 UV 更新、雲端同步與遠端推播需要網路。</w:t>
+              <w:t xml:space="preserve">系統仍採用本機優先的設計，不登入也能使用核心倒數與紀錄。除了瀏覽器通知，使用者也可以主動綁定「防曬晴報員」LINE 官方帳號，在補擦時間到時透過熟悉的 LINE 接收訊息。設定頁提供綁定、測試通知與解除綁定，讓使用者自行選擇提醒管道；即使不使用 LINE，也不影響原本的核心功能。這些遠端提醒需要網路，實際送達仍會受到裝置、平台與網路狀態影響。</w:t>
             </w:r>
           </w:p>
         </w:tc>

</xml_diff>